<commit_message>
Hüsn ü Aşk: DOCX tanpa header, footer, dan nomor halaman untuk InDesign
Co-Authored-By: Claude Opus 5.5 <noreply@anthropic.com>
Claude-Session: https://claude.ai/code/session_01PxfchZDAbz79pW3A49xAa9
</commit_message>
<xml_diff>
--- a/husn-u-ask.docx
+++ b/husn-u-ask.docx
@@ -46,7 +46,7 @@
       <w:pPr>
         <w:sectPr>
           <w:pgSz w:w="8391" w:h="11906" w:orient="portrait"/>
-          <w:pgMar w:top="1134" w:right="1134" w:bottom="1134" w:left="1134" w:header="708" w:footer="567" w:gutter="0"/>
+          <w:pgMar w:top="1134" w:right="1134" w:bottom="1134" w:left="1134" w:header="708" w:footer="708" w:gutter="0"/>
           <w:pgNumType/>
           <w:docGrid w:linePitch="360"/>
         </w:sectPr>
@@ -39235,9 +39235,8 @@
       </w:r>
     </w:p>
     <w:sectPr>
-      <w:footerReference w:type="default" r:id="rId6"/>
       <w:pgSz w:w="8391" w:h="11906" w:orient="portrait"/>
-      <w:pgMar w:top="1134" w:right="1134" w:bottom="1134" w:left="1134" w:header="708" w:footer="567" w:gutter="0"/>
+      <w:pgMar w:top="1134" w:right="1134" w:bottom="1134" w:left="1134" w:header="708" w:footer="708" w:gutter="0"/>
       <w:pgNumType/>
       <w:docGrid w:linePitch="360"/>
     </w:sectPr>
@@ -39280,26 +39279,6 @@
     </w:p>
   </w:endnote>
 </w:endnotes>
-</file>
-
-<file path=word/footer1.xml><?xml version="1.0" encoding="utf-8"?>
-<w:ftr xmlns:wpc="http://schemas.microsoft.com/office/word/2010/wordprocessingCanvas" xmlns:mc="http://schemas.openxmlformats.org/markup-compatibility/2006" xmlns:o="urn:schemas-microsoft-com:office:office" xmlns:r="http://schemas.openxmlformats.org/officeDocument/2006/relationships" xmlns:m="http://schemas.openxmlformats.org/officeDocument/2006/math" xmlns:v="urn:schemas-microsoft-com:vml" xmlns:wp14="http://schemas.microsoft.com/office/word/2010/wordprocessingDrawing" xmlns:wp="http://schemas.openxmlformats.org/drawingml/2006/wordprocessingDrawing" xmlns:w10="urn:schemas-microsoft-com:office:word" xmlns:w="http://schemas.openxmlformats.org/wordprocessingml/2006/main" xmlns:w14="http://schemas.microsoft.com/office/word/2010/wordml" xmlns:w15="http://schemas.microsoft.com/office/word/2012/wordml" xmlns:wpg="http://schemas.microsoft.com/office/word/2010/wordprocessingGroup" xmlns:wpi="http://schemas.microsoft.com/office/word/2010/wordprocessingInk" xmlns:wne="http://schemas.microsoft.com/office/word/2006/wordml" xmlns:wps="http://schemas.microsoft.com/office/word/2010/wordprocessingShape">
-  <w:p>
-    <w:pPr>
-      <w:jc w:val="center"/>
-    </w:pPr>
-    <w:r>
-      <w:rPr>
-        <w:sz w:val="18"/>
-        <w:szCs w:val="18"/>
-      </w:rPr>
-      <w:fldChar w:fldCharType="begin"/>
-      <w:instrText xml:space="preserve">PAGE</w:instrText>
-      <w:fldChar w:fldCharType="separate"/>
-      <w:fldChar w:fldCharType="end"/>
-    </w:r>
-  </w:p>
-</w:ftr>
 </file>
 
 <file path=word/footnotes.xml><?xml version="1.0" encoding="utf-8"?>

</xml_diff>